<commit_message>
Clean up repo: remove scratch files and generated DB
</commit_message>
<xml_diff>
--- a/Tax_RAG_Report.docx
+++ b/Tax_RAG_Report.docx
@@ -1271,17 +1271,46 @@
           <w:color w:val="000000" w:themeColor="text1"/>
         </w:rPr>
       </w:pPr>
-    </w:p>
-    <w:p>
-      <w:pPr>
-        <w:pStyle w:val="Heading1"/>
+      <w:proofErr w:type="spellStart"/>
+      <w:r>
         <w:rPr>
           <w:rFonts w:ascii="Gill Sans" w:hAnsi="Gill Sans" w:cs="Gill Sans"/>
           <w:b w:val="0"/>
           <w:bCs w:val="0"/>
           <w:color w:val="000000" w:themeColor="text1"/>
         </w:rPr>
-      </w:pPr>
+        <w:t>Github</w:t>
+      </w:r>
+      <w:proofErr w:type="spellEnd"/>
+      <w:r>
+        <w:rPr>
+          <w:rFonts w:ascii="Gill Sans" w:hAnsi="Gill Sans" w:cs="Gill Sans"/>
+          <w:b w:val="0"/>
+          <w:bCs w:val="0"/>
+          <w:color w:val="000000" w:themeColor="text1"/>
+        </w:rPr>
+        <w:t xml:space="preserve"> Repo Link:</w:t>
+      </w:r>
+    </w:p>
+    <w:p>
+      <w:pPr>
+        <w:pStyle w:val="Heading1"/>
+        <w:rPr>
+          <w:rFonts w:ascii="Gill Sans" w:hAnsi="Gill Sans" w:cs="Gill Sans"/>
+          <w:b w:val="0"/>
+          <w:bCs w:val="0"/>
+          <w:color w:val="000000" w:themeColor="text1"/>
+        </w:rPr>
+      </w:pPr>
+      <w:r>
+        <w:rPr>
+          <w:rFonts w:ascii="Gill Sans" w:hAnsi="Gill Sans" w:cs="Gill Sans"/>
+          <w:b w:val="0"/>
+          <w:bCs w:val="0"/>
+          <w:color w:val="000000" w:themeColor="text1"/>
+        </w:rPr>
+        <w:t>https://github.com/adithi2903/RAGBot</w:t>
+      </w:r>
     </w:p>
     <w:p>
       <w:pPr>

</xml_diff>